<commit_message>
Update brief v92 to include exact reference quotes directly under their respective points
Co-authored-by: mahfozmt <59177658+mahfozmt@users.noreply.github.com>
</commit_message>
<xml_diff>
--- a/Output/appellate_argument_v92_Brief.docx
+++ b/Output/appellate_argument_v92_Brief.docx
@@ -1267,7 +1267,68 @@
           <w:sz w:val="20"/>
           <w:szCs w:val="20"/>
         </w:rPr>
-        <w:t xml:space="preserve">এই burden-এর প্রশ্নে ৪৪ DLR (AD) ১২৪ (45 DLR (AD) 124) ব্যবহার করা যেতে পারে, যাহা প্রমাণ করে যে record-of-rights-এর presumption খণ্ডনের প্রাথমিক দায়ভার যাহার উপরে, তাহাকে cogent evidence উপস্থাপন করিতে হয়।</w:t>
+        <w:t xml:space="preserve">এই burden-এর প্রশ্নে </w:t>
+      </w:r>
+      <w:r>
+        <w:rPr>
+          <w:rFonts w:ascii="Kalpurush" w:cs="Kalpurush" w:eastAsia="Kalpurush" w:hAnsi="Kalpurush"/>
+          <w:b/>
+          <w:bCs/>
+          <w:sz w:val="20"/>
+          <w:szCs w:val="20"/>
+        </w:rPr>
+        <w:t xml:space="preserve">45 DLR (AD) 124 (Nuruddin Ahmed vs. Md. Jaman)</w:t>
+      </w:r>
+      <w:r>
+        <w:rPr>
+          <w:rFonts w:ascii="Kalpurush" w:cs="Kalpurush" w:eastAsia="Kalpurush" w:hAnsi="Kalpurush"/>
+          <w:sz w:val="20"/>
+          <w:szCs w:val="20"/>
+        </w:rPr>
+        <w:t xml:space="preserve">-এর সিদ্ধান্ত ব্যবহার করা আবশ্যক, যাহা প্রমাণ করে যে record-of-rights-এর presumption খণ্ডনের প্রাথমিক দায়ভার যাহার উপরে, তাহাকে cogent evidence উপস্থাপন করিতে হয়।</w:t>
+      </w:r>
+    </w:p>
+    <w:p>
+      <w:r>
+        <w:rPr>
+          <w:rFonts w:ascii="Kalpurush" w:cs="Kalpurush" w:eastAsia="Kalpurush" w:hAnsi="Kalpurush"/>
+        </w:rPr>
+        <w:t xml:space="preserve"/>
+      </w:r>
+    </w:p>
+    <w:p>
+      <w:pPr>
+        <w:ind w:left="720"/>
+      </w:pPr>
+      <w:r>
+        <w:rPr>
+          <w:rFonts w:ascii="Kalpurush" w:cs="Kalpurush" w:eastAsia="Kalpurush" w:hAnsi="Kalpurush"/>
+          <w:b/>
+          <w:bCs/>
+          <w:i/>
+          <w:iCs/>
+          <w:sz w:val="20"/>
+          <w:szCs w:val="20"/>
+        </w:rPr>
+        <w:t xml:space="preserve">[45 DLR (AD) 124]:</w:t>
+      </w:r>
+      <w:r>
+        <w:rPr>
+          <w:rFonts w:ascii="Kalpurush" w:cs="Kalpurush" w:eastAsia="Kalpurush" w:hAnsi="Kalpurush"/>
+          <w:i/>
+          <w:iCs/>
+          <w:sz w:val="20"/>
+          <w:szCs w:val="20"/>
+        </w:rPr>
+        <w:t xml:space="preserve"> *"A trial court sometimes confuses 'plaintiff must prove' with 'plaintiff must disprove every counter-assertion'. This is erroneous."*</w:t>
+      </w:r>
+    </w:p>
+    <w:p>
+      <w:r>
+        <w:rPr>
+          <w:rFonts w:ascii="Kalpurush" w:cs="Kalpurush" w:eastAsia="Kalpurush" w:hAnsi="Kalpurush"/>
+        </w:rPr>
+        <w:t xml:space="preserve"/>
       </w:r>
     </w:p>
     <w:p>
@@ -1788,98 +1849,25 @@
           <w:sz w:val="20"/>
           <w:szCs w:val="20"/>
         </w:rPr>
-        <w:t xml:space="preserve">এই প্রশ্নে ২৭ BLD ৫৪৪ (27 BLD 544)-এর সিদ্ধান্ত প্রণিধানযোগ্য, যেখানে বলা হইয়াছে যে administrative revenue officer-এর title adjudication-এর jurisdiction নাই।</w:t>
-      </w:r>
-    </w:p>
-    <w:p>
-      <w:r>
-        <w:rPr>
-          <w:rFonts w:ascii="Kalpurush" w:cs="Kalpurush" w:eastAsia="Kalpurush" w:hAnsi="Kalpurush"/>
-        </w:rPr>
-        <w:t xml:space="preserve"/>
-      </w:r>
-    </w:p>
-    <w:p>
-      <w:r>
-        <w:rPr>
-          <w:rFonts w:ascii="Kalpurush" w:cs="Kalpurush" w:eastAsia="Kalpurush" w:hAnsi="Kalpurush"/>
-          <w:sz w:val="20"/>
-          <w:szCs w:val="20"/>
-        </w:rPr>
-        <w:t xml:space="preserve">অতএব বিজ্ঞ ট্রায়াল কোর্টের এই সিদ্ধান্ত আইন ও সাক্ষ্যের পরিপন্থী এবং বাতিলযোগ্য।</w:t>
-      </w:r>
-    </w:p>
-    <w:p>
-      <w:r>
-        <w:rPr>
-          <w:rFonts w:ascii="Kalpurush" w:cs="Kalpurush" w:eastAsia="Kalpurush" w:hAnsi="Kalpurush"/>
-        </w:rPr>
-        <w:t xml:space="preserve"/>
-      </w:r>
-    </w:p>
-    <w:p>
-      <w:pPr>
-        <w:jc w:val="center"/>
-      </w:pPr>
-      <w:r>
-        <w:t xml:space="preserve">--------------------------------------------------</w:t>
-      </w:r>
-    </w:p>
-    <w:p>
-      <w:r>
-        <w:rPr>
-          <w:rFonts w:ascii="Kalpurush" w:cs="Kalpurush" w:eastAsia="Kalpurush" w:hAnsi="Kalpurush"/>
-        </w:rPr>
-        <w:t xml:space="preserve"/>
-      </w:r>
-    </w:p>
-    <w:p>
-      <w:pPr>
-        <w:pStyle w:val="Heading2"/>
-      </w:pPr>
-      <w:r>
-        <w:rPr>
-          <w:rFonts w:ascii="Kalpurush" w:cs="Kalpurush" w:eastAsia="Kalpurush" w:hAnsi="Kalpurush"/>
-          <w:sz w:val="20"/>
-          <w:szCs w:val="20"/>
-        </w:rPr>
-        <w:t xml:space="preserve">৮. সবচেয়ে গুরুত্বপূর্ণ: alleged correction সামান্য clerical correction নয়</w:t>
-      </w:r>
-    </w:p>
-    <w:p>
-      <w:r>
-        <w:rPr>
-          <w:rFonts w:ascii="Kalpurush" w:cs="Kalpurush" w:eastAsia="Kalpurush" w:hAnsi="Kalpurush"/>
-        </w:rPr>
-        <w:t xml:space="preserve"/>
-      </w:r>
-    </w:p>
-    <w:p>
-      <w:r>
-        <w:rPr>
-          <w:rFonts w:ascii="Kalpurush" w:cs="Kalpurush" w:eastAsia="Kalpurush" w:hAnsi="Kalpurush"/>
-          <w:sz w:val="20"/>
-          <w:szCs w:val="20"/>
-        </w:rPr>
-        <w:t xml:space="preserve">মহামান্য আদালত,</w:t>
-      </w:r>
-    </w:p>
-    <w:p>
-      <w:r>
-        <w:rPr>
-          <w:rFonts w:ascii="Kalpurush" w:cs="Kalpurush" w:eastAsia="Kalpurush" w:hAnsi="Kalpurush"/>
-        </w:rPr>
-        <w:t xml:space="preserve"/>
-      </w:r>
-    </w:p>
-    <w:p>
-      <w:r>
-        <w:rPr>
-          <w:rFonts w:ascii="Kalpurush" w:cs="Kalpurush" w:eastAsia="Kalpurush" w:hAnsi="Kalpurush"/>
-          <w:sz w:val="20"/>
-          <w:szCs w:val="20"/>
-        </w:rPr>
-        <w:t xml:space="preserve">যদি কোনো volume-এ—</w:t>
+        <w:t xml:space="preserve">এই প্রশ্নে </w:t>
+      </w:r>
+      <w:r>
+        <w:rPr>
+          <w:rFonts w:ascii="Kalpurush" w:cs="Kalpurush" w:eastAsia="Kalpurush" w:hAnsi="Kalpurush"/>
+          <w:b/>
+          <w:bCs/>
+          <w:sz w:val="20"/>
+          <w:szCs w:val="20"/>
+        </w:rPr>
+        <w:t xml:space="preserve">27 BLD 544</w:t>
+      </w:r>
+      <w:r>
+        <w:rPr>
+          <w:rFonts w:ascii="Kalpurush" w:cs="Kalpurush" w:eastAsia="Kalpurush" w:hAnsi="Kalpurush"/>
+          <w:sz w:val="20"/>
+          <w:szCs w:val="20"/>
+        </w:rPr>
+        <w:t xml:space="preserve">-এর সিদ্ধান্ত প্রণিধানযোগ্য, যেখানে বলা হইয়াছে যে administrative revenue officer-এর title adjudication-এর jurisdiction নাই।</w:t>
       </w:r>
     </w:p>
     <w:p>
@@ -1897,62 +1885,15 @@
       <w:r>
         <w:rPr>
           <w:rFonts w:ascii="Kalpurush" w:cs="Kalpurush" w:eastAsia="Kalpurush" w:hAnsi="Kalpurush"/>
+          <w:b/>
+          <w:bCs/>
           <w:i/>
           <w:iCs/>
           <w:sz w:val="20"/>
           <w:szCs w:val="20"/>
         </w:rPr>
-        <w:t xml:space="preserve">একটি নামের বানান ভুল সংশোধন করা হতো,</w:t>
-      </w:r>
-    </w:p>
-    <w:p>
-      <w:r>
-        <w:rPr>
-          <w:rFonts w:ascii="Kalpurush" w:cs="Kalpurush" w:eastAsia="Kalpurush" w:hAnsi="Kalpurush"/>
-        </w:rPr>
-        <w:t xml:space="preserve"/>
-      </w:r>
-    </w:p>
-    <w:p>
-      <w:r>
-        <w:rPr>
-          <w:rFonts w:ascii="Kalpurush" w:cs="Kalpurush" w:eastAsia="Kalpurush" w:hAnsi="Kalpurush"/>
-          <w:sz w:val="20"/>
-          <w:szCs w:val="20"/>
-        </w:rPr>
-        <w:t xml:space="preserve">তাহলে সেটি clerical correction-এর প্রশ্ন হতে পারত।</w:t>
-      </w:r>
-    </w:p>
-    <w:p>
-      <w:r>
-        <w:rPr>
-          <w:rFonts w:ascii="Kalpurush" w:cs="Kalpurush" w:eastAsia="Kalpurush" w:hAnsi="Kalpurush"/>
-        </w:rPr>
-        <w:t xml:space="preserve"/>
-      </w:r>
-    </w:p>
-    <w:p>
-      <w:r>
-        <w:rPr>
-          <w:rFonts w:ascii="Kalpurush" w:cs="Kalpurush" w:eastAsia="Kalpurush" w:hAnsi="Kalpurush"/>
-          <w:sz w:val="20"/>
-          <w:szCs w:val="20"/>
-        </w:rPr>
-        <w:t xml:space="preserve">কিন্তু এখানে alleged correction-এর effect যদি হয়—</w:t>
-      </w:r>
-    </w:p>
-    <w:p>
-      <w:r>
-        <w:rPr>
-          <w:rFonts w:ascii="Kalpurush" w:cs="Kalpurush" w:eastAsia="Kalpurush" w:hAnsi="Kalpurush"/>
-        </w:rPr>
-        <w:t xml:space="preserve"/>
-      </w:r>
-    </w:p>
-    <w:p>
-      <w:pPr>
-        <w:ind w:left="720"/>
-      </w:pPr>
+        <w:t xml:space="preserve">[27 BLD 544]:</w:t>
+      </w:r>
       <w:r>
         <w:rPr>
           <w:rFonts w:ascii="Kalpurush" w:cs="Kalpurush" w:eastAsia="Kalpurush" w:hAnsi="Kalpurush"/>
@@ -1961,61 +1902,106 @@
           <w:sz w:val="20"/>
           <w:szCs w:val="20"/>
         </w:rPr>
-        <w:t xml:space="preserve">একজন recorded raiyat-এর পরিবর্তে/সঙ্গে অন্য ব্যক্তিকে tenancy interest-এর অংশীদার হিসেবে যুক্ত করা,</w:t>
-      </w:r>
-    </w:p>
-    <w:p>
-      <w:r>
-        <w:rPr>
-          <w:rFonts w:ascii="Kalpurush" w:cs="Kalpurush" w:eastAsia="Kalpurush" w:hAnsi="Kalpurush"/>
-        </w:rPr>
-        <w:t xml:space="preserve"/>
-      </w:r>
-    </w:p>
-    <w:p>
-      <w:r>
-        <w:rPr>
-          <w:rFonts w:ascii="Kalpurush" w:cs="Kalpurush" w:eastAsia="Kalpurush" w:hAnsi="Kalpurush"/>
-          <w:sz w:val="20"/>
-          <w:szCs w:val="20"/>
-        </w:rPr>
-        <w:t xml:space="preserve">তাহলে এটি নিছক clerical correction নয়।</w:t>
-      </w:r>
-    </w:p>
-    <w:p>
-      <w:r>
-        <w:rPr>
-          <w:rFonts w:ascii="Kalpurush" w:cs="Kalpurush" w:eastAsia="Kalpurush" w:hAnsi="Kalpurush"/>
-        </w:rPr>
-        <w:t xml:space="preserve"/>
-      </w:r>
-    </w:p>
-    <w:p>
-      <w:r>
-        <w:rPr>
-          <w:rFonts w:ascii="Kalpurush" w:cs="Kalpurush" w:eastAsia="Kalpurush" w:hAnsi="Kalpurush"/>
-          <w:sz w:val="20"/>
-          <w:szCs w:val="20"/>
-        </w:rPr>
-        <w:t xml:space="preserve">এটি substantive interest-এর প্রশ্ন।</w:t>
-      </w:r>
-    </w:p>
-    <w:p>
-      <w:r>
-        <w:rPr>
-          <w:rFonts w:ascii="Kalpurush" w:cs="Kalpurush" w:eastAsia="Kalpurush" w:hAnsi="Kalpurush"/>
-        </w:rPr>
-        <w:t xml:space="preserve"/>
-      </w:r>
-    </w:p>
-    <w:p>
-      <w:r>
-        <w:rPr>
-          <w:rFonts w:ascii="Kalpurush" w:cs="Kalpurush" w:eastAsia="Kalpurush" w:hAnsi="Kalpurush"/>
-          <w:sz w:val="20"/>
-          <w:szCs w:val="20"/>
-        </w:rPr>
-        <w:t xml:space="preserve">সুতরাং আদালতের সামনে প্রশ্ন হওয়া উচিত:</w:t>
+        <w:t xml:space="preserve"> *"Revenue officer has no jurisdiction to decide the question of title."*</w:t>
+      </w:r>
+    </w:p>
+    <w:p>
+      <w:r>
+        <w:rPr>
+          <w:rFonts w:ascii="Kalpurush" w:cs="Kalpurush" w:eastAsia="Kalpurush" w:hAnsi="Kalpurush"/>
+        </w:rPr>
+        <w:t xml:space="preserve"/>
+      </w:r>
+    </w:p>
+    <w:p>
+      <w:r>
+        <w:rPr>
+          <w:rFonts w:ascii="Kalpurush" w:cs="Kalpurush" w:eastAsia="Kalpurush" w:hAnsi="Kalpurush"/>
+        </w:rPr>
+        <w:t xml:space="preserve"/>
+      </w:r>
+    </w:p>
+    <w:p>
+      <w:r>
+        <w:rPr>
+          <w:rFonts w:ascii="Kalpurush" w:cs="Kalpurush" w:eastAsia="Kalpurush" w:hAnsi="Kalpurush"/>
+          <w:sz w:val="20"/>
+          <w:szCs w:val="20"/>
+        </w:rPr>
+        <w:t xml:space="preserve">অতএব বিজ্ঞ ট্রায়াল কোর্টের এই সিদ্ধান্ত আইন ও সাক্ষ্যের পরিপন্থী এবং বাতিলযোগ্য।</w:t>
+      </w:r>
+    </w:p>
+    <w:p>
+      <w:r>
+        <w:rPr>
+          <w:rFonts w:ascii="Kalpurush" w:cs="Kalpurush" w:eastAsia="Kalpurush" w:hAnsi="Kalpurush"/>
+        </w:rPr>
+        <w:t xml:space="preserve"/>
+      </w:r>
+    </w:p>
+    <w:p>
+      <w:pPr>
+        <w:jc w:val="center"/>
+      </w:pPr>
+      <w:r>
+        <w:t xml:space="preserve">--------------------------------------------------</w:t>
+      </w:r>
+    </w:p>
+    <w:p>
+      <w:r>
+        <w:rPr>
+          <w:rFonts w:ascii="Kalpurush" w:cs="Kalpurush" w:eastAsia="Kalpurush" w:hAnsi="Kalpurush"/>
+        </w:rPr>
+        <w:t xml:space="preserve"/>
+      </w:r>
+    </w:p>
+    <w:p>
+      <w:pPr>
+        <w:pStyle w:val="Heading2"/>
+      </w:pPr>
+      <w:r>
+        <w:rPr>
+          <w:rFonts w:ascii="Kalpurush" w:cs="Kalpurush" w:eastAsia="Kalpurush" w:hAnsi="Kalpurush"/>
+          <w:sz w:val="20"/>
+          <w:szCs w:val="20"/>
+        </w:rPr>
+        <w:t xml:space="preserve">৮. সবচেয়ে গুরুত্বপূর্ণ: alleged correction সামান্য clerical correction নয়</w:t>
+      </w:r>
+    </w:p>
+    <w:p>
+      <w:r>
+        <w:rPr>
+          <w:rFonts w:ascii="Kalpurush" w:cs="Kalpurush" w:eastAsia="Kalpurush" w:hAnsi="Kalpurush"/>
+        </w:rPr>
+        <w:t xml:space="preserve"/>
+      </w:r>
+    </w:p>
+    <w:p>
+      <w:r>
+        <w:rPr>
+          <w:rFonts w:ascii="Kalpurush" w:cs="Kalpurush" w:eastAsia="Kalpurush" w:hAnsi="Kalpurush"/>
+          <w:sz w:val="20"/>
+          <w:szCs w:val="20"/>
+        </w:rPr>
+        <w:t xml:space="preserve">মহামান্য আদালত,</w:t>
+      </w:r>
+    </w:p>
+    <w:p>
+      <w:r>
+        <w:rPr>
+          <w:rFonts w:ascii="Kalpurush" w:cs="Kalpurush" w:eastAsia="Kalpurush" w:hAnsi="Kalpurush"/>
+        </w:rPr>
+        <w:t xml:space="preserve"/>
+      </w:r>
+    </w:p>
+    <w:p>
+      <w:r>
+        <w:rPr>
+          <w:rFonts w:ascii="Kalpurush" w:cs="Kalpurush" w:eastAsia="Kalpurush" w:hAnsi="Kalpurush"/>
+          <w:sz w:val="20"/>
+          <w:szCs w:val="20"/>
+        </w:rPr>
+        <w:t xml:space="preserve">যদি কোনো volume-এ—</w:t>
       </w:r>
     </w:p>
     <w:p>
@@ -2038,6 +2024,142 @@
           <w:sz w:val="20"/>
           <w:szCs w:val="20"/>
         </w:rPr>
+        <w:t xml:space="preserve">একটি নামের বানান ভুল সংশোধন করা হতো,</w:t>
+      </w:r>
+    </w:p>
+    <w:p>
+      <w:r>
+        <w:rPr>
+          <w:rFonts w:ascii="Kalpurush" w:cs="Kalpurush" w:eastAsia="Kalpurush" w:hAnsi="Kalpurush"/>
+        </w:rPr>
+        <w:t xml:space="preserve"/>
+      </w:r>
+    </w:p>
+    <w:p>
+      <w:r>
+        <w:rPr>
+          <w:rFonts w:ascii="Kalpurush" w:cs="Kalpurush" w:eastAsia="Kalpurush" w:hAnsi="Kalpurush"/>
+          <w:sz w:val="20"/>
+          <w:szCs w:val="20"/>
+        </w:rPr>
+        <w:t xml:space="preserve">তাহলে সেটি clerical correction-এর প্রশ্ন হতে পারত।</w:t>
+      </w:r>
+    </w:p>
+    <w:p>
+      <w:r>
+        <w:rPr>
+          <w:rFonts w:ascii="Kalpurush" w:cs="Kalpurush" w:eastAsia="Kalpurush" w:hAnsi="Kalpurush"/>
+        </w:rPr>
+        <w:t xml:space="preserve"/>
+      </w:r>
+    </w:p>
+    <w:p>
+      <w:r>
+        <w:rPr>
+          <w:rFonts w:ascii="Kalpurush" w:cs="Kalpurush" w:eastAsia="Kalpurush" w:hAnsi="Kalpurush"/>
+          <w:sz w:val="20"/>
+          <w:szCs w:val="20"/>
+        </w:rPr>
+        <w:t xml:space="preserve">কিন্তু এখানে alleged correction-এর effect যদি হয়—</w:t>
+      </w:r>
+    </w:p>
+    <w:p>
+      <w:r>
+        <w:rPr>
+          <w:rFonts w:ascii="Kalpurush" w:cs="Kalpurush" w:eastAsia="Kalpurush" w:hAnsi="Kalpurush"/>
+        </w:rPr>
+        <w:t xml:space="preserve"/>
+      </w:r>
+    </w:p>
+    <w:p>
+      <w:pPr>
+        <w:ind w:left="720"/>
+      </w:pPr>
+      <w:r>
+        <w:rPr>
+          <w:rFonts w:ascii="Kalpurush" w:cs="Kalpurush" w:eastAsia="Kalpurush" w:hAnsi="Kalpurush"/>
+          <w:i/>
+          <w:iCs/>
+          <w:sz w:val="20"/>
+          <w:szCs w:val="20"/>
+        </w:rPr>
+        <w:t xml:space="preserve">একজন recorded raiyat-এর পরিবর্তে/সঙ্গে অন্য ব্যক্তিকে tenancy interest-এর অংশীদার হিসেবে যুক্ত করা,</w:t>
+      </w:r>
+    </w:p>
+    <w:p>
+      <w:r>
+        <w:rPr>
+          <w:rFonts w:ascii="Kalpurush" w:cs="Kalpurush" w:eastAsia="Kalpurush" w:hAnsi="Kalpurush"/>
+        </w:rPr>
+        <w:t xml:space="preserve"/>
+      </w:r>
+    </w:p>
+    <w:p>
+      <w:r>
+        <w:rPr>
+          <w:rFonts w:ascii="Kalpurush" w:cs="Kalpurush" w:eastAsia="Kalpurush" w:hAnsi="Kalpurush"/>
+          <w:sz w:val="20"/>
+          <w:szCs w:val="20"/>
+        </w:rPr>
+        <w:t xml:space="preserve">তাহলে এটি নিছক clerical correction নয়।</w:t>
+      </w:r>
+    </w:p>
+    <w:p>
+      <w:r>
+        <w:rPr>
+          <w:rFonts w:ascii="Kalpurush" w:cs="Kalpurush" w:eastAsia="Kalpurush" w:hAnsi="Kalpurush"/>
+        </w:rPr>
+        <w:t xml:space="preserve"/>
+      </w:r>
+    </w:p>
+    <w:p>
+      <w:r>
+        <w:rPr>
+          <w:rFonts w:ascii="Kalpurush" w:cs="Kalpurush" w:eastAsia="Kalpurush" w:hAnsi="Kalpurush"/>
+          <w:sz w:val="20"/>
+          <w:szCs w:val="20"/>
+        </w:rPr>
+        <w:t xml:space="preserve">এটি substantive interest-এর প্রশ্ন।</w:t>
+      </w:r>
+    </w:p>
+    <w:p>
+      <w:r>
+        <w:rPr>
+          <w:rFonts w:ascii="Kalpurush" w:cs="Kalpurush" w:eastAsia="Kalpurush" w:hAnsi="Kalpurush"/>
+        </w:rPr>
+        <w:t xml:space="preserve"/>
+      </w:r>
+    </w:p>
+    <w:p>
+      <w:r>
+        <w:rPr>
+          <w:rFonts w:ascii="Kalpurush" w:cs="Kalpurush" w:eastAsia="Kalpurush" w:hAnsi="Kalpurush"/>
+          <w:sz w:val="20"/>
+          <w:szCs w:val="20"/>
+        </w:rPr>
+        <w:t xml:space="preserve">সুতরাং আদালতের সামনে প্রশ্ন হওয়া উচিত:</w:t>
+      </w:r>
+    </w:p>
+    <w:p>
+      <w:r>
+        <w:rPr>
+          <w:rFonts w:ascii="Kalpurush" w:cs="Kalpurush" w:eastAsia="Kalpurush" w:hAnsi="Kalpurush"/>
+        </w:rPr>
+        <w:t xml:space="preserve"/>
+      </w:r>
+    </w:p>
+    <w:p>
+      <w:pPr>
+        <w:ind w:left="720"/>
+      </w:pPr>
+      <w:r>
+        <w:rPr>
+          <w:rFonts w:ascii="Kalpurush" w:cs="Kalpurush" w:eastAsia="Kalpurush" w:hAnsi="Kalpurush"/>
+          <w:i/>
+          <w:iCs/>
+          <w:sz w:val="20"/>
+          <w:szCs w:val="20"/>
+        </w:rPr>
         <w:t xml:space="preserve">একজন revenue officer-এর একটি volume note কি substantive title/tenancy interest সৃষ্টি বা পরিবর্তনের আইনগত source হতে পারে?</w:t>
       </w:r>
     </w:p>
@@ -2056,7 +2178,123 @@
           <w:sz w:val="20"/>
           <w:szCs w:val="20"/>
         </w:rPr>
-        <w:t xml:space="preserve">এই point-টি ৫৩ DLR ১৯ (53 DLR 19) এবং ২৯ BLC ১৬০ (29 BLC 160)-এর সহিত ধারাবাহিকভাবে উপস্থাপন করা যায়, যেখানে স্পষ্ট করা হইয়াছে যে mutation/correction-এর মাধ্যমে substantive title সৃষ্ট বা খর্ব হয় না।</w:t>
+        <w:t xml:space="preserve">এই point-টি </w:t>
+      </w:r>
+      <w:r>
+        <w:rPr>
+          <w:rFonts w:ascii="Kalpurush" w:cs="Kalpurush" w:eastAsia="Kalpurush" w:hAnsi="Kalpurush"/>
+          <w:b/>
+          <w:bCs/>
+          <w:sz w:val="20"/>
+          <w:szCs w:val="20"/>
+        </w:rPr>
+        <w:t xml:space="preserve">53 DLR 19</w:t>
+      </w:r>
+      <w:r>
+        <w:rPr>
+          <w:rFonts w:ascii="Kalpurush" w:cs="Kalpurush" w:eastAsia="Kalpurush" w:hAnsi="Kalpurush"/>
+          <w:sz w:val="20"/>
+          <w:szCs w:val="20"/>
+        </w:rPr>
+        <w:t xml:space="preserve"> এবং </w:t>
+      </w:r>
+      <w:r>
+        <w:rPr>
+          <w:rFonts w:ascii="Kalpurush" w:cs="Kalpurush" w:eastAsia="Kalpurush" w:hAnsi="Kalpurush"/>
+          <w:b/>
+          <w:bCs/>
+          <w:sz w:val="20"/>
+          <w:szCs w:val="20"/>
+        </w:rPr>
+        <w:t xml:space="preserve">29 BLC 160</w:t>
+      </w:r>
+      <w:r>
+        <w:rPr>
+          <w:rFonts w:ascii="Kalpurush" w:cs="Kalpurush" w:eastAsia="Kalpurush" w:hAnsi="Kalpurush"/>
+          <w:sz w:val="20"/>
+          <w:szCs w:val="20"/>
+        </w:rPr>
+        <w:t xml:space="preserve">-এর সহিত ধারাবাহিকভাবে উপস্থাপন করা যায়, যেখানে স্পষ্ট করা হইয়াছে যে mutation/correction-এর মাধ্যমে substantive title সৃষ্ট বা খর্ব হয় না।</w:t>
+      </w:r>
+    </w:p>
+    <w:p>
+      <w:r>
+        <w:rPr>
+          <w:rFonts w:ascii="Kalpurush" w:cs="Kalpurush" w:eastAsia="Kalpurush" w:hAnsi="Kalpurush"/>
+        </w:rPr>
+        <w:t xml:space="preserve"/>
+      </w:r>
+    </w:p>
+    <w:p>
+      <w:pPr>
+        <w:ind w:left="720"/>
+      </w:pPr>
+      <w:r>
+        <w:rPr>
+          <w:rFonts w:ascii="Kalpurush" w:cs="Kalpurush" w:eastAsia="Kalpurush" w:hAnsi="Kalpurush"/>
+          <w:b/>
+          <w:bCs/>
+          <w:i/>
+          <w:iCs/>
+          <w:sz w:val="20"/>
+          <w:szCs w:val="20"/>
+        </w:rPr>
+        <w:t xml:space="preserve">[53 DLR 19]:</w:t>
+      </w:r>
+      <w:r>
+        <w:rPr>
+          <w:rFonts w:ascii="Kalpurush" w:cs="Kalpurush" w:eastAsia="Kalpurush" w:hAnsi="Kalpurush"/>
+          <w:i/>
+          <w:iCs/>
+          <w:sz w:val="20"/>
+          <w:szCs w:val="20"/>
+        </w:rPr>
+        <w:t xml:space="preserve"> *"Mutation does not confer any title, nor does its cancellation extinguish any title."*</w:t>
+      </w:r>
+    </w:p>
+    <w:p>
+      <w:r>
+        <w:rPr>
+          <w:rFonts w:ascii="Kalpurush" w:cs="Kalpurush" w:eastAsia="Kalpurush" w:hAnsi="Kalpurush"/>
+          <w:sz w:val="20"/>
+          <w:szCs w:val="20"/>
+        </w:rPr>
+        <w:t xml:space="preserve">&gt;</w:t>
+      </w:r>
+    </w:p>
+    <w:p>
+      <w:pPr>
+        <w:ind w:left="720"/>
+      </w:pPr>
+      <w:r>
+        <w:rPr>
+          <w:rFonts w:ascii="Kalpurush" w:cs="Kalpurush" w:eastAsia="Kalpurush" w:hAnsi="Kalpurush"/>
+          <w:b/>
+          <w:bCs/>
+          <w:i/>
+          <w:iCs/>
+          <w:sz w:val="20"/>
+          <w:szCs w:val="20"/>
+        </w:rPr>
+        <w:t xml:space="preserve">[29 BLC 160]:</w:t>
+      </w:r>
+      <w:r>
+        <w:rPr>
+          <w:rFonts w:ascii="Kalpurush" w:cs="Kalpurush" w:eastAsia="Kalpurush" w:hAnsi="Kalpurush"/>
+          <w:i/>
+          <w:iCs/>
+          <w:sz w:val="20"/>
+          <w:szCs w:val="20"/>
+        </w:rPr>
+        <w:t xml:space="preserve"> *"Correction of record of rights does not create any title in favour of a person in whose name the record of rights is corrected."*</w:t>
+      </w:r>
+    </w:p>
+    <w:p>
+      <w:r>
+        <w:rPr>
+          <w:rFonts w:ascii="Kalpurush" w:cs="Kalpurush" w:eastAsia="Kalpurush" w:hAnsi="Kalpurush"/>
+        </w:rPr>
+        <w:t xml:space="preserve"/>
       </w:r>
     </w:p>
     <w:p>
@@ -2361,7 +2599,68 @@
           <w:sz w:val="20"/>
           <w:szCs w:val="20"/>
         </w:rPr>
-        <w:t xml:space="preserve">বিশেষ করে DW-4 যদি entry-এর handwriting/ink/কারণ/parent file শনাক্ত বা ব্যাখ্যা করতে না পারেন, তাহলে entry-এর evidentiary weight স্বাভাবিকভাবেই প্রশ্নের মুখে পড়ে। এখানে ৫৩ DLR ১৯ (53 DLR 19) সরাসরি কার্যকর।</w:t>
+        <w:t xml:space="preserve">বিশেষ করে DW-4 যদি entry-এর handwriting/ink/কারণ/parent file শনাক্ত বা ব্যাখ্যা করতে না পারেন, তাহলে entry-এর evidentiary weight স্বাভাবিকভাবেই প্রশ্নের মুখে পড়ে। এখানে </w:t>
+      </w:r>
+      <w:r>
+        <w:rPr>
+          <w:rFonts w:ascii="Kalpurush" w:cs="Kalpurush" w:eastAsia="Kalpurush" w:hAnsi="Kalpurush"/>
+          <w:b/>
+          <w:bCs/>
+          <w:sz w:val="20"/>
+          <w:szCs w:val="20"/>
+        </w:rPr>
+        <w:t xml:space="preserve">53 DLR 19</w:t>
+      </w:r>
+      <w:r>
+        <w:rPr>
+          <w:rFonts w:ascii="Kalpurush" w:cs="Kalpurush" w:eastAsia="Kalpurush" w:hAnsi="Kalpurush"/>
+          <w:sz w:val="20"/>
+          <w:szCs w:val="20"/>
+        </w:rPr>
+        <w:t xml:space="preserve"> সরাসরি কার্যকর।</w:t>
+      </w:r>
+    </w:p>
+    <w:p>
+      <w:r>
+        <w:rPr>
+          <w:rFonts w:ascii="Kalpurush" w:cs="Kalpurush" w:eastAsia="Kalpurush" w:hAnsi="Kalpurush"/>
+        </w:rPr>
+        <w:t xml:space="preserve"/>
+      </w:r>
+    </w:p>
+    <w:p>
+      <w:pPr>
+        <w:ind w:left="720"/>
+      </w:pPr>
+      <w:r>
+        <w:rPr>
+          <w:rFonts w:ascii="Kalpurush" w:cs="Kalpurush" w:eastAsia="Kalpurush" w:hAnsi="Kalpurush"/>
+          <w:b/>
+          <w:bCs/>
+          <w:i/>
+          <w:iCs/>
+          <w:sz w:val="20"/>
+          <w:szCs w:val="20"/>
+        </w:rPr>
+        <w:t xml:space="preserve">[53 DLR 19]:</w:t>
+      </w:r>
+      <w:r>
+        <w:rPr>
+          <w:rFonts w:ascii="Kalpurush" w:cs="Kalpurush" w:eastAsia="Kalpurush" w:hAnsi="Kalpurush"/>
+          <w:i/>
+          <w:iCs/>
+          <w:sz w:val="20"/>
+          <w:szCs w:val="20"/>
+        </w:rPr>
+        <w:t xml:space="preserve"> *"If an order of mutation is passed without any legal basis, such order is a nullity in the eye of law."*</w:t>
+      </w:r>
+    </w:p>
+    <w:p>
+      <w:r>
+        <w:rPr>
+          <w:rFonts w:ascii="Kalpurush" w:cs="Kalpurush" w:eastAsia="Kalpurush" w:hAnsi="Kalpurush"/>
+        </w:rPr>
+        <w:t xml:space="preserve"/>
       </w:r>
     </w:p>
     <w:p>
@@ -3255,116 +3554,43 @@
           <w:sz w:val="20"/>
           <w:szCs w:val="20"/>
         </w:rPr>
-        <w:t xml:space="preserve">এখানে ৫৩ DLR ১৯ (53 DLR 19) এবং ১ BLT ১৮ (1 BLT 18)-এর propositions ব্যবহার করে volume entry-এর evidentiary weakness দেখানো যায়।</w:t>
-      </w:r>
-    </w:p>
-    <w:p>
-      <w:r>
-        <w:rPr>
-          <w:rFonts w:ascii="Kalpurush" w:cs="Kalpurush" w:eastAsia="Kalpurush" w:hAnsi="Kalpurush"/>
-        </w:rPr>
-        <w:t xml:space="preserve"/>
-      </w:r>
-    </w:p>
-    <w:p>
-      <w:r>
-        <w:rPr>
-          <w:rFonts w:ascii="Kalpurush" w:cs="Kalpurush" w:eastAsia="Kalpurush" w:hAnsi="Kalpurush"/>
-          <w:sz w:val="20"/>
-          <w:szCs w:val="20"/>
-        </w:rPr>
-        <w:t xml:space="preserve">অতএব বিজ্ঞ ট্রায়াল কোর্টের এই সিদ্ধান্ত আইন ও সাক্ষ্যের পরিপন্থী এবং বাতিলযোগ্য।</w:t>
-      </w:r>
-    </w:p>
-    <w:p>
-      <w:r>
-        <w:rPr>
-          <w:rFonts w:ascii="Kalpurush" w:cs="Kalpurush" w:eastAsia="Kalpurush" w:hAnsi="Kalpurush"/>
-        </w:rPr>
-        <w:t xml:space="preserve"/>
-      </w:r>
-    </w:p>
-    <w:p>
-      <w:pPr>
-        <w:jc w:val="center"/>
-      </w:pPr>
-      <w:r>
-        <w:t xml:space="preserve">--------------------------------------------------</w:t>
-      </w:r>
-    </w:p>
-    <w:p>
-      <w:r>
-        <w:rPr>
-          <w:rFonts w:ascii="Kalpurush" w:cs="Kalpurush" w:eastAsia="Kalpurush" w:hAnsi="Kalpurush"/>
-        </w:rPr>
-        <w:t xml:space="preserve"/>
-      </w:r>
-    </w:p>
-    <w:p>
-      <w:pPr>
-        <w:pStyle w:val="Heading2"/>
-      </w:pPr>
-      <w:r>
-        <w:rPr>
-          <w:rFonts w:ascii="Kalpurush" w:cs="Kalpurush" w:eastAsia="Kalpurush" w:hAnsi="Kalpurush"/>
-          <w:sz w:val="20"/>
-          <w:szCs w:val="20"/>
-        </w:rPr>
-        <w:t xml:space="preserve">১৪. আব্দুল আলীর পরবর্তী registered transaction—স্বাধীন corroboration</w:t>
-      </w:r>
-    </w:p>
-    <w:p>
-      <w:r>
-        <w:rPr>
-          <w:rFonts w:ascii="Kalpurush" w:cs="Kalpurush" w:eastAsia="Kalpurush" w:hAnsi="Kalpurush"/>
-        </w:rPr>
-        <w:t xml:space="preserve"/>
-      </w:r>
-    </w:p>
-    <w:p>
-      <w:r>
-        <w:rPr>
-          <w:rFonts w:ascii="Kalpurush" w:cs="Kalpurush" w:eastAsia="Kalpurush" w:hAnsi="Kalpurush"/>
-          <w:sz w:val="20"/>
-          <w:szCs w:val="20"/>
-        </w:rPr>
-        <w:t xml:space="preserve">১৯৫৭ সালের ২৩৯৮ নং registered deed-এ আব্দুল আলীর মাধ্যমে SA ২৩৮-সংক্রান্ত সম্পত্তির transaction হওয়াটিও আদালতের বিবেচনার দাবি রাখে।</w:t>
-      </w:r>
-    </w:p>
-    <w:p>
-      <w:r>
-        <w:rPr>
-          <w:rFonts w:ascii="Kalpurush" w:cs="Kalpurush" w:eastAsia="Kalpurush" w:hAnsi="Kalpurush"/>
-        </w:rPr>
-        <w:t xml:space="preserve"/>
-      </w:r>
-    </w:p>
-    <w:p>
-      <w:r>
-        <w:rPr>
-          <w:rFonts w:ascii="Kalpurush" w:cs="Kalpurush" w:eastAsia="Kalpurush" w:hAnsi="Kalpurush"/>
-          <w:sz w:val="20"/>
-          <w:szCs w:val="20"/>
-        </w:rPr>
-        <w:t xml:space="preserve">এটি একা SA record-এর title সৃষ্টি করে—এমন দাবি আমরা করছি না।</w:t>
-      </w:r>
-    </w:p>
-    <w:p>
-      <w:r>
-        <w:rPr>
-          <w:rFonts w:ascii="Kalpurush" w:cs="Kalpurush" w:eastAsia="Kalpurush" w:hAnsi="Kalpurush"/>
-        </w:rPr>
-        <w:t xml:space="preserve"/>
-      </w:r>
-    </w:p>
-    <w:p>
-      <w:r>
-        <w:rPr>
-          <w:rFonts w:ascii="Kalpurush" w:cs="Kalpurush" w:eastAsia="Kalpurush" w:hAnsi="Kalpurush"/>
-          <w:sz w:val="20"/>
-          <w:szCs w:val="20"/>
-        </w:rPr>
-        <w:t xml:space="preserve">বরং:</w:t>
+        <w:t xml:space="preserve">এখানে </w:t>
+      </w:r>
+      <w:r>
+        <w:rPr>
+          <w:rFonts w:ascii="Kalpurush" w:cs="Kalpurush" w:eastAsia="Kalpurush" w:hAnsi="Kalpurush"/>
+          <w:b/>
+          <w:bCs/>
+          <w:sz w:val="20"/>
+          <w:szCs w:val="20"/>
+        </w:rPr>
+        <w:t xml:space="preserve">53 DLR 19</w:t>
+      </w:r>
+      <w:r>
+        <w:rPr>
+          <w:rFonts w:ascii="Kalpurush" w:cs="Kalpurush" w:eastAsia="Kalpurush" w:hAnsi="Kalpurush"/>
+          <w:sz w:val="20"/>
+          <w:szCs w:val="20"/>
+        </w:rPr>
+        <w:t xml:space="preserve"> এবং </w:t>
+      </w:r>
+      <w:r>
+        <w:rPr>
+          <w:rFonts w:ascii="Kalpurush" w:cs="Kalpurush" w:eastAsia="Kalpurush" w:hAnsi="Kalpurush"/>
+          <w:b/>
+          <w:bCs/>
+          <w:sz w:val="20"/>
+          <w:szCs w:val="20"/>
+        </w:rPr>
+        <w:t xml:space="preserve">1 BLT 18</w:t>
+      </w:r>
+      <w:r>
+        <w:rPr>
+          <w:rFonts w:ascii="Kalpurush" w:cs="Kalpurush" w:eastAsia="Kalpurush" w:hAnsi="Kalpurush"/>
+          <w:sz w:val="20"/>
+          <w:szCs w:val="20"/>
+        </w:rPr>
+        <w:t xml:space="preserve">-এর propositions ব্যবহার করে volume entry-এর evidentiary weakness দেখানো যায়।</w:t>
       </w:r>
     </w:p>
     <w:p>
@@ -3382,281 +3608,15 @@
       <w:r>
         <w:rPr>
           <w:rFonts w:ascii="Kalpurush" w:cs="Kalpurush" w:eastAsia="Kalpurush" w:hAnsi="Kalpurush"/>
+          <w:b/>
+          <w:bCs/>
           <w:i/>
           <w:iCs/>
           <w:sz w:val="20"/>
           <w:szCs w:val="20"/>
         </w:rPr>
-        <w:t xml:space="preserve">SA record-এ আব্দুল আলীর নাম + পরবর্তী registered transaction-এ তাঁর recorded identity—এই দুইটি circumstance একই direction-এ যায়।</w:t>
-      </w:r>
-    </w:p>
-    <w:p>
-      <w:r>
-        <w:rPr>
-          <w:rFonts w:ascii="Kalpurush" w:cs="Kalpurush" w:eastAsia="Kalpurush" w:hAnsi="Kalpurush"/>
-        </w:rPr>
-        <w:t xml:space="preserve"/>
-      </w:r>
-    </w:p>
-    <w:p>
-      <w:r>
-        <w:rPr>
-          <w:rFonts w:ascii="Kalpurush" w:cs="Kalpurush" w:eastAsia="Kalpurush" w:hAnsi="Kalpurush"/>
-          <w:sz w:val="20"/>
-          <w:szCs w:val="20"/>
-        </w:rPr>
-        <w:t xml:space="preserve">অন্যদিকে বিবাদীপক্ষের title theory-তে যে foundational tenancy এবং correction-এর উপর নির্ভর করা হচ্ছে, তার primary documentary chain অনুপস্থিত।</w:t>
-      </w:r>
-    </w:p>
-    <w:p>
-      <w:r>
-        <w:rPr>
-          <w:rFonts w:ascii="Kalpurush" w:cs="Kalpurush" w:eastAsia="Kalpurush" w:hAnsi="Kalpurush"/>
-        </w:rPr>
-        <w:t xml:space="preserve"/>
-      </w:r>
-    </w:p>
-    <w:p>
-      <w:r>
-        <w:rPr>
-          <w:rFonts w:ascii="Kalpurush" w:cs="Kalpurush" w:eastAsia="Kalpurush" w:hAnsi="Kalpurush"/>
-          <w:sz w:val="20"/>
-          <w:szCs w:val="20"/>
-        </w:rPr>
-        <w:t xml:space="preserve">এই contrast-টি আদালতের কাছে গুরুত্বপূর্ণ।</w:t>
-      </w:r>
-    </w:p>
-    <w:p>
-      <w:r>
-        <w:rPr>
-          <w:rFonts w:ascii="Kalpurush" w:cs="Kalpurush" w:eastAsia="Kalpurush" w:hAnsi="Kalpurush"/>
-        </w:rPr>
-        <w:t xml:space="preserve"/>
-      </w:r>
-    </w:p>
-    <w:p>
-      <w:r>
-        <w:rPr>
-          <w:rFonts w:ascii="Kalpurush" w:cs="Kalpurush" w:eastAsia="Kalpurush" w:hAnsi="Kalpurush"/>
-          <w:sz w:val="20"/>
-          <w:szCs w:val="20"/>
-        </w:rPr>
-        <w:t xml:space="preserve">অতএব বিজ্ঞ ট্রায়াল কোর্টের এই সিদ্ধান্ত আইন ও সাক্ষ্যের পরিপন্থী এবং বাতিলযোগ্য।</w:t>
-      </w:r>
-    </w:p>
-    <w:p>
-      <w:r>
-        <w:rPr>
-          <w:rFonts w:ascii="Kalpurush" w:cs="Kalpurush" w:eastAsia="Kalpurush" w:hAnsi="Kalpurush"/>
-        </w:rPr>
-        <w:t xml:space="preserve"/>
-      </w:r>
-    </w:p>
-    <w:p>
-      <w:pPr>
-        <w:jc w:val="center"/>
-      </w:pPr>
-      <w:r>
-        <w:t xml:space="preserve">--------------------------------------------------</w:t>
-      </w:r>
-    </w:p>
-    <w:p>
-      <w:r>
-        <w:rPr>
-          <w:rFonts w:ascii="Kalpurush" w:cs="Kalpurush" w:eastAsia="Kalpurush" w:hAnsi="Kalpurush"/>
-        </w:rPr>
-        <w:t xml:space="preserve"/>
-      </w:r>
-    </w:p>
-    <w:p>
-      <w:pPr>
-        <w:pStyle w:val="Heading2"/>
-      </w:pPr>
-      <w:r>
-        <w:rPr>
-          <w:rFonts w:ascii="Kalpurush" w:cs="Kalpurush" w:eastAsia="Kalpurush" w:hAnsi="Kalpurush"/>
-          <w:sz w:val="20"/>
-          <w:szCs w:val="20"/>
-        </w:rPr>
-        <w:t xml:space="preserve">১৫. একই দাগে পৃথক খতিয়ান থাকলে পুরো দাগকে hotchpot-এ টানার যুক্তি গ্রহণযোগ্য নয়</w:t>
-      </w:r>
-    </w:p>
-    <w:p>
-      <w:r>
-        <w:rPr>
-          <w:rFonts w:ascii="Kalpurush" w:cs="Kalpurush" w:eastAsia="Kalpurush" w:hAnsi="Kalpurush"/>
-        </w:rPr>
-        <w:t xml:space="preserve"/>
-      </w:r>
-    </w:p>
-    <w:p>
-      <w:r>
-        <w:rPr>
-          <w:rFonts w:ascii="Kalpurush" w:cs="Kalpurush" w:eastAsia="Kalpurush" w:hAnsi="Kalpurush"/>
-          <w:sz w:val="20"/>
-          <w:szCs w:val="20"/>
-        </w:rPr>
-        <w:t xml:space="preserve">এখানে Trial Court-এর hotchpot reasoning-কে factual structure দিয়ে counter করা উচিত।</w:t>
-      </w:r>
-    </w:p>
-    <w:p>
-      <w:r>
-        <w:rPr>
-          <w:rFonts w:ascii="Kalpurush" w:cs="Kalpurush" w:eastAsia="Kalpurush" w:hAnsi="Kalpurush"/>
-        </w:rPr>
-        <w:t xml:space="preserve"/>
-      </w:r>
-    </w:p>
-    <w:p>
-      <w:r>
-        <w:rPr>
-          <w:rFonts w:ascii="Kalpurush" w:cs="Kalpurush" w:eastAsia="Kalpurush" w:hAnsi="Kalpurush"/>
-          <w:sz w:val="20"/>
-          <w:szCs w:val="20"/>
-        </w:rPr>
-        <w:t xml:space="preserve">আমাদের অবস্থান:</w:t>
-      </w:r>
-    </w:p>
-    <w:p>
-      <w:r>
-        <w:rPr>
-          <w:rFonts w:ascii="Kalpurush" w:cs="Kalpurush" w:eastAsia="Kalpurush" w:hAnsi="Kalpurush"/>
-        </w:rPr>
-        <w:t xml:space="preserve"/>
-      </w:r>
-    </w:p>
-    <w:p>
-      <w:r>
-        <w:rPr>
-          <w:rFonts w:ascii="Kalpurush" w:cs="Kalpurush" w:eastAsia="Kalpurush" w:hAnsi="Kalpurush"/>
-          <w:sz w:val="20"/>
-          <w:szCs w:val="20"/>
-        </w:rPr>
-        <w:t xml:space="preserve">দাগ একই হতে পারে; কিন্তু খতিয়ান/tenancy identity একই হওয়া আবশ্যক নয়।</w:t>
-      </w:r>
-    </w:p>
-    <w:p>
-      <w:r>
-        <w:rPr>
-          <w:rFonts w:ascii="Kalpurush" w:cs="Kalpurush" w:eastAsia="Kalpurush" w:hAnsi="Kalpurush"/>
-        </w:rPr>
-        <w:t xml:space="preserve"/>
-      </w:r>
-    </w:p>
-    <w:p>
-      <w:r>
-        <w:rPr>
-          <w:rFonts w:ascii="Kalpurush" w:cs="Kalpurush" w:eastAsia="Kalpurush" w:hAnsi="Kalpurush"/>
-          <w:sz w:val="20"/>
-          <w:szCs w:val="20"/>
-        </w:rPr>
-        <w:t xml:space="preserve">যদি একই দাগের মধ্যে—</w:t>
-      </w:r>
-    </w:p>
-    <w:p>
-      <w:r>
-        <w:rPr>
-          <w:rFonts w:ascii="Kalpurush" w:cs="Kalpurush" w:eastAsia="Kalpurush" w:hAnsi="Kalpurush"/>
-        </w:rPr>
-        <w:t xml:space="preserve"/>
-      </w:r>
-    </w:p>
-    <w:p>
-      <w:r>
-        <w:rPr>
-          <w:rFonts w:ascii="Kalpurush" w:cs="Kalpurush" w:eastAsia="Kalpurush" w:hAnsi="Kalpurush"/>
-          <w:sz w:val="20"/>
-          <w:szCs w:val="20"/>
-        </w:rPr>
-        <w:t xml:space="preserve">1.  SA 238-এর ব্যক্তিগত tenancy;</w:t>
-      </w:r>
-    </w:p>
-    <w:p>
-      <w:r>
-        <w:rPr>
-          <w:rFonts w:ascii="Kalpurush" w:cs="Kalpurush" w:eastAsia="Kalpurush" w:hAnsi="Kalpurush"/>
-          <w:sz w:val="20"/>
-          <w:szCs w:val="20"/>
-        </w:rPr>
-        <w:t xml:space="preserve">2.  Government-এর পৃথক khatian;</w:t>
-      </w:r>
-    </w:p>
-    <w:p>
-      <w:r>
-        <w:rPr>
-          <w:rFonts w:ascii="Kalpurush" w:cs="Kalpurush" w:eastAsia="Kalpurush" w:hAnsi="Kalpurush"/>
-          <w:sz w:val="20"/>
-          <w:szCs w:val="20"/>
-        </w:rPr>
-        <w:t xml:space="preserve">3.  এবং Government অংশের উপর plaintiffs কোনো title/partition relief দাবি না করে,</w:t>
-      </w:r>
-    </w:p>
-    <w:p>
-      <w:r>
-        <w:rPr>
-          <w:rFonts w:ascii="Kalpurush" w:cs="Kalpurush" w:eastAsia="Kalpurush" w:hAnsi="Kalpurush"/>
-        </w:rPr>
-        <w:t xml:space="preserve"/>
-      </w:r>
-    </w:p>
-    <w:p>
-      <w:r>
-        <w:rPr>
-          <w:rFonts w:ascii="Kalpurush" w:cs="Kalpurush" w:eastAsia="Kalpurush" w:hAnsi="Kalpurush"/>
-          <w:sz w:val="20"/>
-          <w:szCs w:val="20"/>
-        </w:rPr>
-        <w:t xml:space="preserve">তাহলে partition-এর subject matter নির্ধারণ করতে হবে claimed co-sharers-এর title এবং relevant tenancy-এর extent অনুযায়ী।</w:t>
-      </w:r>
-    </w:p>
-    <w:p>
-      <w:r>
-        <w:rPr>
-          <w:rFonts w:ascii="Kalpurush" w:cs="Kalpurush" w:eastAsia="Kalpurush" w:hAnsi="Kalpurush"/>
-        </w:rPr>
-        <w:t xml:space="preserve"/>
-      </w:r>
-    </w:p>
-    <w:p>
-      <w:r>
-        <w:rPr>
-          <w:rFonts w:ascii="Kalpurush" w:cs="Kalpurush" w:eastAsia="Kalpurush" w:hAnsi="Kalpurush"/>
-          <w:sz w:val="20"/>
-          <w:szCs w:val="20"/>
-        </w:rPr>
-        <w:t xml:space="preserve">অন্য khatian-এর Government land-কে plaintiffs নিজেদের partition property হিসেবে দাবি করছেন না।</w:t>
-      </w:r>
-    </w:p>
-    <w:p>
-      <w:r>
-        <w:rPr>
-          <w:rFonts w:ascii="Kalpurush" w:cs="Kalpurush" w:eastAsia="Kalpurush" w:hAnsi="Kalpurush"/>
-        </w:rPr>
-        <w:t xml:space="preserve"/>
-      </w:r>
-    </w:p>
-    <w:p>
-      <w:r>
-        <w:rPr>
-          <w:rFonts w:ascii="Kalpurush" w:cs="Kalpurush" w:eastAsia="Kalpurush" w:hAnsi="Kalpurush"/>
-          <w:sz w:val="20"/>
-          <w:szCs w:val="20"/>
-        </w:rPr>
-        <w:t xml:space="preserve">সুতরাং প্রশ্ন:</w:t>
-      </w:r>
-    </w:p>
-    <w:p>
-      <w:r>
-        <w:rPr>
-          <w:rFonts w:ascii="Kalpurush" w:cs="Kalpurush" w:eastAsia="Kalpurush" w:hAnsi="Kalpurush"/>
-        </w:rPr>
-        <w:t xml:space="preserve"/>
-      </w:r>
-    </w:p>
-    <w:p>
-      <w:pPr>
-        <w:ind w:left="720"/>
-      </w:pPr>
+        <w:t xml:space="preserve">[1 BLT 18]:</w:t>
+      </w:r>
       <w:r>
         <w:rPr>
           <w:rFonts w:ascii="Kalpurush" w:cs="Kalpurush" w:eastAsia="Kalpurush" w:hAnsi="Kalpurush"/>
@@ -3665,43 +3625,15 @@
           <w:sz w:val="20"/>
           <w:szCs w:val="20"/>
         </w:rPr>
-        <w:t xml:space="preserve">যে জমির উপর কোনো share দাবি করা হয়নি, সেটিকে বাদ দেওয়াই কি hotchpot defect সৃষ্টি করে?</w:t>
-      </w:r>
-    </w:p>
-    <w:p>
-      <w:r>
-        <w:rPr>
-          <w:rFonts w:ascii="Kalpurush" w:cs="Kalpurush" w:eastAsia="Kalpurush" w:hAnsi="Kalpurush"/>
-        </w:rPr>
-        <w:t xml:space="preserve"/>
-      </w:r>
-    </w:p>
-    <w:p>
-      <w:r>
-        <w:rPr>
-          <w:rFonts w:ascii="Kalpurush" w:cs="Kalpurush" w:eastAsia="Kalpurush" w:hAnsi="Kalpurush"/>
-          <w:sz w:val="20"/>
-          <w:szCs w:val="20"/>
-        </w:rPr>
-        <w:t xml:space="preserve">এই প্রশ্নের উত্তর “হ্যাঁ” হতে হলে আগে দেখাতে হবে যে উক্ত Government land একই joint tenancy-এর অবিচ্ছেদ্য অংশ।</w:t>
-      </w:r>
-    </w:p>
-    <w:p>
-      <w:r>
-        <w:rPr>
-          <w:rFonts w:ascii="Kalpurush" w:cs="Kalpurush" w:eastAsia="Kalpurush" w:hAnsi="Kalpurush"/>
-        </w:rPr>
-        <w:t xml:space="preserve"/>
-      </w:r>
-    </w:p>
-    <w:p>
-      <w:r>
-        <w:rPr>
-          <w:rFonts w:ascii="Kalpurush" w:cs="Kalpurush" w:eastAsia="Kalpurush" w:hAnsi="Kalpurush"/>
-          <w:sz w:val="20"/>
-          <w:szCs w:val="20"/>
-        </w:rPr>
-        <w:t xml:space="preserve">যদি পৃথক khatian ও পৃথক Government status বিদ্যমান থাকে, তাহলে সেই factual foundation অনুপস্থিত।</w:t>
+        <w:t xml:space="preserve"> *"Where the parent document/order is not produced, secondary evidence or consequential entry carries no evidentiary value to prove title."*</w:t>
+      </w:r>
+    </w:p>
+    <w:p>
+      <w:r>
+        <w:rPr>
+          <w:rFonts w:ascii="Kalpurush" w:cs="Kalpurush" w:eastAsia="Kalpurush" w:hAnsi="Kalpurush"/>
+        </w:rPr>
+        <w:t xml:space="preserve"/>
       </w:r>
     </w:p>
     <w:p>
@@ -3756,43 +3688,61 @@
           <w:sz w:val="20"/>
           <w:szCs w:val="20"/>
         </w:rPr>
-        <w:t xml:space="preserve">১৬. সরকারকে party করার প্রশ্নেও relief-based test প্রয়োগ করা উচিত</w:t>
-      </w:r>
-    </w:p>
-    <w:p>
-      <w:r>
-        <w:rPr>
-          <w:rFonts w:ascii="Kalpurush" w:cs="Kalpurush" w:eastAsia="Kalpurush" w:hAnsi="Kalpurush"/>
-        </w:rPr>
-        <w:t xml:space="preserve"/>
-      </w:r>
-    </w:p>
-    <w:p>
-      <w:r>
-        <w:rPr>
-          <w:rFonts w:ascii="Kalpurush" w:cs="Kalpurush" w:eastAsia="Kalpurush" w:hAnsi="Kalpurush"/>
-          <w:sz w:val="20"/>
-          <w:szCs w:val="20"/>
-        </w:rPr>
-        <w:t xml:space="preserve">সরকারকে কেবল এই কারণে necessary party করা যাবে না যে একই dag number-এর মধ্যে Government land আছে।</w:t>
-      </w:r>
-    </w:p>
-    <w:p>
-      <w:r>
-        <w:rPr>
-          <w:rFonts w:ascii="Kalpurush" w:cs="Kalpurush" w:eastAsia="Kalpurush" w:hAnsi="Kalpurush"/>
-        </w:rPr>
-        <w:t xml:space="preserve"/>
-      </w:r>
-    </w:p>
-    <w:p>
-      <w:r>
-        <w:rPr>
-          <w:rFonts w:ascii="Kalpurush" w:cs="Kalpurush" w:eastAsia="Kalpurush" w:hAnsi="Kalpurush"/>
-          <w:sz w:val="20"/>
-          <w:szCs w:val="20"/>
-        </w:rPr>
-        <w:t xml:space="preserve">প্রথমে দেখতে হবে:</w:t>
+        <w:t xml:space="preserve">১৪. আব্দুল আলীর পরবর্তী registered transaction—স্বাধীন corroboration</w:t>
+      </w:r>
+    </w:p>
+    <w:p>
+      <w:r>
+        <w:rPr>
+          <w:rFonts w:ascii="Kalpurush" w:cs="Kalpurush" w:eastAsia="Kalpurush" w:hAnsi="Kalpurush"/>
+        </w:rPr>
+        <w:t xml:space="preserve"/>
+      </w:r>
+    </w:p>
+    <w:p>
+      <w:r>
+        <w:rPr>
+          <w:rFonts w:ascii="Kalpurush" w:cs="Kalpurush" w:eastAsia="Kalpurush" w:hAnsi="Kalpurush"/>
+          <w:sz w:val="20"/>
+          <w:szCs w:val="20"/>
+        </w:rPr>
+        <w:t xml:space="preserve">১৯৫৭ সালের ২৩৯৮ নং registered deed-এ আব্দুল আলীর মাধ্যমে SA ২৩৮-সংক্রান্ত সম্পত্তির transaction হওয়াটিও আদালতের বিবেচনার দাবি রাখে।</w:t>
+      </w:r>
+    </w:p>
+    <w:p>
+      <w:r>
+        <w:rPr>
+          <w:rFonts w:ascii="Kalpurush" w:cs="Kalpurush" w:eastAsia="Kalpurush" w:hAnsi="Kalpurush"/>
+        </w:rPr>
+        <w:t xml:space="preserve"/>
+      </w:r>
+    </w:p>
+    <w:p>
+      <w:r>
+        <w:rPr>
+          <w:rFonts w:ascii="Kalpurush" w:cs="Kalpurush" w:eastAsia="Kalpurush" w:hAnsi="Kalpurush"/>
+          <w:sz w:val="20"/>
+          <w:szCs w:val="20"/>
+        </w:rPr>
+        <w:t xml:space="preserve">এটি একা SA record-এর title সৃষ্টি করে—এমন দাবি আমরা করছি না।</w:t>
+      </w:r>
+    </w:p>
+    <w:p>
+      <w:r>
+        <w:rPr>
+          <w:rFonts w:ascii="Kalpurush" w:cs="Kalpurush" w:eastAsia="Kalpurush" w:hAnsi="Kalpurush"/>
+        </w:rPr>
+        <w:t xml:space="preserve"/>
+      </w:r>
+    </w:p>
+    <w:p>
+      <w:r>
+        <w:rPr>
+          <w:rFonts w:ascii="Kalpurush" w:cs="Kalpurush" w:eastAsia="Kalpurush" w:hAnsi="Kalpurush"/>
+          <w:sz w:val="20"/>
+          <w:szCs w:val="20"/>
+        </w:rPr>
+        <w:t xml:space="preserve">বরং:</w:t>
       </w:r>
     </w:p>
     <w:p>
@@ -3815,6 +3765,434 @@
           <w:sz w:val="20"/>
           <w:szCs w:val="20"/>
         </w:rPr>
+        <w:t xml:space="preserve">SA record-এ আব্দুল আলীর নাম + পরবর্তী registered transaction-এ তাঁর recorded identity—এই দুইটি circumstance একই direction-এ যায়।</w:t>
+      </w:r>
+    </w:p>
+    <w:p>
+      <w:r>
+        <w:rPr>
+          <w:rFonts w:ascii="Kalpurush" w:cs="Kalpurush" w:eastAsia="Kalpurush" w:hAnsi="Kalpurush"/>
+        </w:rPr>
+        <w:t xml:space="preserve"/>
+      </w:r>
+    </w:p>
+    <w:p>
+      <w:r>
+        <w:rPr>
+          <w:rFonts w:ascii="Kalpurush" w:cs="Kalpurush" w:eastAsia="Kalpurush" w:hAnsi="Kalpurush"/>
+          <w:sz w:val="20"/>
+          <w:szCs w:val="20"/>
+        </w:rPr>
+        <w:t xml:space="preserve">অন্যদিকে বিবাদীপক্ষের title theory-তে যে foundational tenancy এবং correction-এর উপর নির্ভর করা হচ্ছে, তার primary documentary chain অনুপস্থিত।</w:t>
+      </w:r>
+    </w:p>
+    <w:p>
+      <w:r>
+        <w:rPr>
+          <w:rFonts w:ascii="Kalpurush" w:cs="Kalpurush" w:eastAsia="Kalpurush" w:hAnsi="Kalpurush"/>
+        </w:rPr>
+        <w:t xml:space="preserve"/>
+      </w:r>
+    </w:p>
+    <w:p>
+      <w:r>
+        <w:rPr>
+          <w:rFonts w:ascii="Kalpurush" w:cs="Kalpurush" w:eastAsia="Kalpurush" w:hAnsi="Kalpurush"/>
+          <w:sz w:val="20"/>
+          <w:szCs w:val="20"/>
+        </w:rPr>
+        <w:t xml:space="preserve">এই contrast-টি আদালতের কাছে গুরুত্বপূর্ণ।</w:t>
+      </w:r>
+    </w:p>
+    <w:p>
+      <w:r>
+        <w:rPr>
+          <w:rFonts w:ascii="Kalpurush" w:cs="Kalpurush" w:eastAsia="Kalpurush" w:hAnsi="Kalpurush"/>
+        </w:rPr>
+        <w:t xml:space="preserve"/>
+      </w:r>
+    </w:p>
+    <w:p>
+      <w:r>
+        <w:rPr>
+          <w:rFonts w:ascii="Kalpurush" w:cs="Kalpurush" w:eastAsia="Kalpurush" w:hAnsi="Kalpurush"/>
+          <w:sz w:val="20"/>
+          <w:szCs w:val="20"/>
+        </w:rPr>
+        <w:t xml:space="preserve">অতএব বিজ্ঞ ট্রায়াল কোর্টের এই সিদ্ধান্ত আইন ও সাক্ষ্যের পরিপন্থী এবং বাতিলযোগ্য।</w:t>
+      </w:r>
+    </w:p>
+    <w:p>
+      <w:r>
+        <w:rPr>
+          <w:rFonts w:ascii="Kalpurush" w:cs="Kalpurush" w:eastAsia="Kalpurush" w:hAnsi="Kalpurush"/>
+        </w:rPr>
+        <w:t xml:space="preserve"/>
+      </w:r>
+    </w:p>
+    <w:p>
+      <w:pPr>
+        <w:jc w:val="center"/>
+      </w:pPr>
+      <w:r>
+        <w:t xml:space="preserve">--------------------------------------------------</w:t>
+      </w:r>
+    </w:p>
+    <w:p>
+      <w:r>
+        <w:rPr>
+          <w:rFonts w:ascii="Kalpurush" w:cs="Kalpurush" w:eastAsia="Kalpurush" w:hAnsi="Kalpurush"/>
+        </w:rPr>
+        <w:t xml:space="preserve"/>
+      </w:r>
+    </w:p>
+    <w:p>
+      <w:pPr>
+        <w:pStyle w:val="Heading2"/>
+      </w:pPr>
+      <w:r>
+        <w:rPr>
+          <w:rFonts w:ascii="Kalpurush" w:cs="Kalpurush" w:eastAsia="Kalpurush" w:hAnsi="Kalpurush"/>
+          <w:sz w:val="20"/>
+          <w:szCs w:val="20"/>
+        </w:rPr>
+        <w:t xml:space="preserve">১৫. একই দাগে পৃথক খতিয়ান থাকলে পুরো দাগকে hotchpot-এ টানার যুক্তি গ্রহণযোগ্য নয়</w:t>
+      </w:r>
+    </w:p>
+    <w:p>
+      <w:r>
+        <w:rPr>
+          <w:rFonts w:ascii="Kalpurush" w:cs="Kalpurush" w:eastAsia="Kalpurush" w:hAnsi="Kalpurush"/>
+        </w:rPr>
+        <w:t xml:space="preserve"/>
+      </w:r>
+    </w:p>
+    <w:p>
+      <w:r>
+        <w:rPr>
+          <w:rFonts w:ascii="Kalpurush" w:cs="Kalpurush" w:eastAsia="Kalpurush" w:hAnsi="Kalpurush"/>
+          <w:sz w:val="20"/>
+          <w:szCs w:val="20"/>
+        </w:rPr>
+        <w:t xml:space="preserve">এখানে Trial Court-এর hotchpot reasoning-কে factual structure দিয়ে counter করা উচিত।</w:t>
+      </w:r>
+    </w:p>
+    <w:p>
+      <w:r>
+        <w:rPr>
+          <w:rFonts w:ascii="Kalpurush" w:cs="Kalpurush" w:eastAsia="Kalpurush" w:hAnsi="Kalpurush"/>
+        </w:rPr>
+        <w:t xml:space="preserve"/>
+      </w:r>
+    </w:p>
+    <w:p>
+      <w:r>
+        <w:rPr>
+          <w:rFonts w:ascii="Kalpurush" w:cs="Kalpurush" w:eastAsia="Kalpurush" w:hAnsi="Kalpurush"/>
+          <w:sz w:val="20"/>
+          <w:szCs w:val="20"/>
+        </w:rPr>
+        <w:t xml:space="preserve">আমাদের অবস্থান:</w:t>
+      </w:r>
+    </w:p>
+    <w:p>
+      <w:r>
+        <w:rPr>
+          <w:rFonts w:ascii="Kalpurush" w:cs="Kalpurush" w:eastAsia="Kalpurush" w:hAnsi="Kalpurush"/>
+        </w:rPr>
+        <w:t xml:space="preserve"/>
+      </w:r>
+    </w:p>
+    <w:p>
+      <w:r>
+        <w:rPr>
+          <w:rFonts w:ascii="Kalpurush" w:cs="Kalpurush" w:eastAsia="Kalpurush" w:hAnsi="Kalpurush"/>
+          <w:sz w:val="20"/>
+          <w:szCs w:val="20"/>
+        </w:rPr>
+        <w:t xml:space="preserve">দাগ একই হতে পারে; কিন্তু খতিয়ান/tenancy identity একই হওয়া আবশ্যক নয়।</w:t>
+      </w:r>
+    </w:p>
+    <w:p>
+      <w:r>
+        <w:rPr>
+          <w:rFonts w:ascii="Kalpurush" w:cs="Kalpurush" w:eastAsia="Kalpurush" w:hAnsi="Kalpurush"/>
+        </w:rPr>
+        <w:t xml:space="preserve"/>
+      </w:r>
+    </w:p>
+    <w:p>
+      <w:r>
+        <w:rPr>
+          <w:rFonts w:ascii="Kalpurush" w:cs="Kalpurush" w:eastAsia="Kalpurush" w:hAnsi="Kalpurush"/>
+          <w:sz w:val="20"/>
+          <w:szCs w:val="20"/>
+        </w:rPr>
+        <w:t xml:space="preserve">যদি একই দাগের মধ্যে—</w:t>
+      </w:r>
+    </w:p>
+    <w:p>
+      <w:r>
+        <w:rPr>
+          <w:rFonts w:ascii="Kalpurush" w:cs="Kalpurush" w:eastAsia="Kalpurush" w:hAnsi="Kalpurush"/>
+        </w:rPr>
+        <w:t xml:space="preserve"/>
+      </w:r>
+    </w:p>
+    <w:p>
+      <w:r>
+        <w:rPr>
+          <w:rFonts w:ascii="Kalpurush" w:cs="Kalpurush" w:eastAsia="Kalpurush" w:hAnsi="Kalpurush"/>
+          <w:sz w:val="20"/>
+          <w:szCs w:val="20"/>
+        </w:rPr>
+        <w:t xml:space="preserve">1.  SA 238-এর ব্যক্তিগত tenancy;</w:t>
+      </w:r>
+    </w:p>
+    <w:p>
+      <w:r>
+        <w:rPr>
+          <w:rFonts w:ascii="Kalpurush" w:cs="Kalpurush" w:eastAsia="Kalpurush" w:hAnsi="Kalpurush"/>
+          <w:sz w:val="20"/>
+          <w:szCs w:val="20"/>
+        </w:rPr>
+        <w:t xml:space="preserve">2.  Government-এর পৃথক khatian;</w:t>
+      </w:r>
+    </w:p>
+    <w:p>
+      <w:r>
+        <w:rPr>
+          <w:rFonts w:ascii="Kalpurush" w:cs="Kalpurush" w:eastAsia="Kalpurush" w:hAnsi="Kalpurush"/>
+          <w:sz w:val="20"/>
+          <w:szCs w:val="20"/>
+        </w:rPr>
+        <w:t xml:space="preserve">3.  এবং Government অংশের উপর plaintiffs কোনো title/partition relief দাবি না করে,</w:t>
+      </w:r>
+    </w:p>
+    <w:p>
+      <w:r>
+        <w:rPr>
+          <w:rFonts w:ascii="Kalpurush" w:cs="Kalpurush" w:eastAsia="Kalpurush" w:hAnsi="Kalpurush"/>
+        </w:rPr>
+        <w:t xml:space="preserve"/>
+      </w:r>
+    </w:p>
+    <w:p>
+      <w:r>
+        <w:rPr>
+          <w:rFonts w:ascii="Kalpurush" w:cs="Kalpurush" w:eastAsia="Kalpurush" w:hAnsi="Kalpurush"/>
+          <w:sz w:val="20"/>
+          <w:szCs w:val="20"/>
+        </w:rPr>
+        <w:t xml:space="preserve">তাহলে partition-এর subject matter নির্ধারণ করতে হবে claimed co-sharers-এর title এবং relevant tenancy-এর extent অনুযায়ী।</w:t>
+      </w:r>
+    </w:p>
+    <w:p>
+      <w:r>
+        <w:rPr>
+          <w:rFonts w:ascii="Kalpurush" w:cs="Kalpurush" w:eastAsia="Kalpurush" w:hAnsi="Kalpurush"/>
+        </w:rPr>
+        <w:t xml:space="preserve"/>
+      </w:r>
+    </w:p>
+    <w:p>
+      <w:r>
+        <w:rPr>
+          <w:rFonts w:ascii="Kalpurush" w:cs="Kalpurush" w:eastAsia="Kalpurush" w:hAnsi="Kalpurush"/>
+          <w:sz w:val="20"/>
+          <w:szCs w:val="20"/>
+        </w:rPr>
+        <w:t xml:space="preserve">অন্য khatian-এর Government land-কে plaintiffs নিজেদের partition property হিসেবে দাবি করছেন না।</w:t>
+      </w:r>
+    </w:p>
+    <w:p>
+      <w:r>
+        <w:rPr>
+          <w:rFonts w:ascii="Kalpurush" w:cs="Kalpurush" w:eastAsia="Kalpurush" w:hAnsi="Kalpurush"/>
+        </w:rPr>
+        <w:t xml:space="preserve"/>
+      </w:r>
+    </w:p>
+    <w:p>
+      <w:r>
+        <w:rPr>
+          <w:rFonts w:ascii="Kalpurush" w:cs="Kalpurush" w:eastAsia="Kalpurush" w:hAnsi="Kalpurush"/>
+          <w:sz w:val="20"/>
+          <w:szCs w:val="20"/>
+        </w:rPr>
+        <w:t xml:space="preserve">সুতরাং প্রশ্ন:</w:t>
+      </w:r>
+    </w:p>
+    <w:p>
+      <w:r>
+        <w:rPr>
+          <w:rFonts w:ascii="Kalpurush" w:cs="Kalpurush" w:eastAsia="Kalpurush" w:hAnsi="Kalpurush"/>
+        </w:rPr>
+        <w:t xml:space="preserve"/>
+      </w:r>
+    </w:p>
+    <w:p>
+      <w:pPr>
+        <w:ind w:left="720"/>
+      </w:pPr>
+      <w:r>
+        <w:rPr>
+          <w:rFonts w:ascii="Kalpurush" w:cs="Kalpurush" w:eastAsia="Kalpurush" w:hAnsi="Kalpurush"/>
+          <w:i/>
+          <w:iCs/>
+          <w:sz w:val="20"/>
+          <w:szCs w:val="20"/>
+        </w:rPr>
+        <w:t xml:space="preserve">যে জমির উপর কোনো share দাবি করা হয়নি, সেটিকে বাদ দেওয়াই কি hotchpot defect সৃষ্টি করে?</w:t>
+      </w:r>
+    </w:p>
+    <w:p>
+      <w:r>
+        <w:rPr>
+          <w:rFonts w:ascii="Kalpurush" w:cs="Kalpurush" w:eastAsia="Kalpurush" w:hAnsi="Kalpurush"/>
+        </w:rPr>
+        <w:t xml:space="preserve"/>
+      </w:r>
+    </w:p>
+    <w:p>
+      <w:r>
+        <w:rPr>
+          <w:rFonts w:ascii="Kalpurush" w:cs="Kalpurush" w:eastAsia="Kalpurush" w:hAnsi="Kalpurush"/>
+          <w:sz w:val="20"/>
+          <w:szCs w:val="20"/>
+        </w:rPr>
+        <w:t xml:space="preserve">এই প্রশ্নের উত্তর “হ্যাঁ” হতে হলে আগে দেখাতে হবে যে উক্ত Government land একই joint tenancy-এর অবিচ্ছেদ্য অংশ।</w:t>
+      </w:r>
+    </w:p>
+    <w:p>
+      <w:r>
+        <w:rPr>
+          <w:rFonts w:ascii="Kalpurush" w:cs="Kalpurush" w:eastAsia="Kalpurush" w:hAnsi="Kalpurush"/>
+        </w:rPr>
+        <w:t xml:space="preserve"/>
+      </w:r>
+    </w:p>
+    <w:p>
+      <w:r>
+        <w:rPr>
+          <w:rFonts w:ascii="Kalpurush" w:cs="Kalpurush" w:eastAsia="Kalpurush" w:hAnsi="Kalpurush"/>
+          <w:sz w:val="20"/>
+          <w:szCs w:val="20"/>
+        </w:rPr>
+        <w:t xml:space="preserve">যদি পৃথক khatian ও পৃথক Government status বিদ্যমান থাকে, তাহলে সেই factual foundation অনুপস্থিত।</w:t>
+      </w:r>
+    </w:p>
+    <w:p>
+      <w:r>
+        <w:rPr>
+          <w:rFonts w:ascii="Kalpurush" w:cs="Kalpurush" w:eastAsia="Kalpurush" w:hAnsi="Kalpurush"/>
+        </w:rPr>
+        <w:t xml:space="preserve"/>
+      </w:r>
+    </w:p>
+    <w:p>
+      <w:r>
+        <w:rPr>
+          <w:rFonts w:ascii="Kalpurush" w:cs="Kalpurush" w:eastAsia="Kalpurush" w:hAnsi="Kalpurush"/>
+          <w:sz w:val="20"/>
+          <w:szCs w:val="20"/>
+        </w:rPr>
+        <w:t xml:space="preserve">অতএব বিজ্ঞ ট্রায়াল কোর্টের এই সিদ্ধান্ত আইন ও সাক্ষ্যের পরিপন্থী এবং বাতিলযোগ্য।</w:t>
+      </w:r>
+    </w:p>
+    <w:p>
+      <w:r>
+        <w:rPr>
+          <w:rFonts w:ascii="Kalpurush" w:cs="Kalpurush" w:eastAsia="Kalpurush" w:hAnsi="Kalpurush"/>
+        </w:rPr>
+        <w:t xml:space="preserve"/>
+      </w:r>
+    </w:p>
+    <w:p>
+      <w:pPr>
+        <w:jc w:val="center"/>
+      </w:pPr>
+      <w:r>
+        <w:t xml:space="preserve">--------------------------------------------------</w:t>
+      </w:r>
+    </w:p>
+    <w:p>
+      <w:r>
+        <w:rPr>
+          <w:rFonts w:ascii="Kalpurush" w:cs="Kalpurush" w:eastAsia="Kalpurush" w:hAnsi="Kalpurush"/>
+        </w:rPr>
+        <w:t xml:space="preserve"/>
+      </w:r>
+    </w:p>
+    <w:p>
+      <w:pPr>
+        <w:pStyle w:val="Heading2"/>
+      </w:pPr>
+      <w:r>
+        <w:rPr>
+          <w:rFonts w:ascii="Kalpurush" w:cs="Kalpurush" w:eastAsia="Kalpurush" w:hAnsi="Kalpurush"/>
+          <w:sz w:val="20"/>
+          <w:szCs w:val="20"/>
+        </w:rPr>
+        <w:t xml:space="preserve">১৬. সরকারকে party করার প্রশ্নেও relief-based test প্রয়োগ করা উচিত</w:t>
+      </w:r>
+    </w:p>
+    <w:p>
+      <w:r>
+        <w:rPr>
+          <w:rFonts w:ascii="Kalpurush" w:cs="Kalpurush" w:eastAsia="Kalpurush" w:hAnsi="Kalpurush"/>
+        </w:rPr>
+        <w:t xml:space="preserve"/>
+      </w:r>
+    </w:p>
+    <w:p>
+      <w:r>
+        <w:rPr>
+          <w:rFonts w:ascii="Kalpurush" w:cs="Kalpurush" w:eastAsia="Kalpurush" w:hAnsi="Kalpurush"/>
+          <w:sz w:val="20"/>
+          <w:szCs w:val="20"/>
+        </w:rPr>
+        <w:t xml:space="preserve">সরকারকে কেবল এই কারণে necessary party করা যাবে না যে একই dag number-এর মধ্যে Government land আছে।</w:t>
+      </w:r>
+    </w:p>
+    <w:p>
+      <w:r>
+        <w:rPr>
+          <w:rFonts w:ascii="Kalpurush" w:cs="Kalpurush" w:eastAsia="Kalpurush" w:hAnsi="Kalpurush"/>
+        </w:rPr>
+        <w:t xml:space="preserve"/>
+      </w:r>
+    </w:p>
+    <w:p>
+      <w:r>
+        <w:rPr>
+          <w:rFonts w:ascii="Kalpurush" w:cs="Kalpurush" w:eastAsia="Kalpurush" w:hAnsi="Kalpurush"/>
+          <w:sz w:val="20"/>
+          <w:szCs w:val="20"/>
+        </w:rPr>
+        <w:t xml:space="preserve">প্রথমে দেখতে হবে:</w:t>
+      </w:r>
+    </w:p>
+    <w:p>
+      <w:r>
+        <w:rPr>
+          <w:rFonts w:ascii="Kalpurush" w:cs="Kalpurush" w:eastAsia="Kalpurush" w:hAnsi="Kalpurush"/>
+        </w:rPr>
+        <w:t xml:space="preserve"/>
+      </w:r>
+    </w:p>
+    <w:p>
+      <w:pPr>
+        <w:ind w:left="720"/>
+      </w:pPr>
+      <w:r>
+        <w:rPr>
+          <w:rFonts w:ascii="Kalpurush" w:cs="Kalpurush" w:eastAsia="Kalpurush" w:hAnsi="Kalpurush"/>
+          <w:i/>
+          <w:iCs/>
+          <w:sz w:val="20"/>
+          <w:szCs w:val="20"/>
+        </w:rPr>
         <w:t xml:space="preserve">বাদীপক্ষ সরকারের বিরুদ্ধে কোনো declaration, recovery, partition বা অন্য substantive relief চেয়েছে কি না?</w:t>
       </w:r>
     </w:p>
@@ -3851,7 +4229,50 @@
           <w:sz w:val="20"/>
           <w:szCs w:val="20"/>
         </w:rPr>
-        <w:t xml:space="preserve">অতএব non-joinder-এর প্রশ্নটি title issue-এর ফল নয়; বরং relief এবং subject matter-এর উপর নির্ভরশীল। (৪৯ DLR (AD) ১৫ (49 DLR (AD) 15) দ্রষ্টব্য)।</w:t>
+        <w:t xml:space="preserve">অতএব non-joinder-এর প্রশ্নটি title issue-এর ফল নয়; বরং relief এবং subject matter-এর উপর নির্ভরশীল।</w:t>
+      </w:r>
+    </w:p>
+    <w:p>
+      <w:r>
+        <w:rPr>
+          <w:rFonts w:ascii="Kalpurush" w:cs="Kalpurush" w:eastAsia="Kalpurush" w:hAnsi="Kalpurush"/>
+        </w:rPr>
+        <w:t xml:space="preserve"/>
+      </w:r>
+    </w:p>
+    <w:p>
+      <w:pPr>
+        <w:ind w:left="720"/>
+      </w:pPr>
+      <w:r>
+        <w:rPr>
+          <w:rFonts w:ascii="Kalpurush" w:cs="Kalpurush" w:eastAsia="Kalpurush" w:hAnsi="Kalpurush"/>
+          <w:b/>
+          <w:bCs/>
+          <w:i/>
+          <w:iCs/>
+          <w:sz w:val="20"/>
+          <w:szCs w:val="20"/>
+        </w:rPr>
+        <w:t xml:space="preserve">[49 DLR (AD) 15]:</w:t>
+      </w:r>
+      <w:r>
+        <w:rPr>
+          <w:rFonts w:ascii="Kalpurush" w:cs="Kalpurush" w:eastAsia="Kalpurush" w:hAnsi="Kalpurush"/>
+          <w:i/>
+          <w:iCs/>
+          <w:sz w:val="20"/>
+          <w:szCs w:val="20"/>
+        </w:rPr>
+        <w:t xml:space="preserve"> *"Non-joinder of a party against whom no relief is claimed is not fatal to the suit."*</w:t>
+      </w:r>
+    </w:p>
+    <w:p>
+      <w:r>
+        <w:rPr>
+          <w:rFonts w:ascii="Kalpurush" w:cs="Kalpurush" w:eastAsia="Kalpurush" w:hAnsi="Kalpurush"/>
+        </w:rPr>
+        <w:t xml:space="preserve"/>
       </w:r>
     </w:p>
     <w:p>

</xml_diff>